<commit_message>
Fix SyntaxError: replace triple-quote docstrings with hash comments
Word copy-paste converts triple-double-quotes to smart/curly quotes,
breaking Python string parsing. All header blocks now use # comments
which are immune to Word formatting changes.

https://claude.ai/code/session_018maF3AQc7XwVViJq1gRTvp
</commit_message>
<xml_diff>
--- a/GrapheneEffect_Analysis.docx
+++ b/GrapheneEffect_Analysis.docx
@@ -8,17 +8,17 @@
         <w:jc w:val="center"/>
       </w:pPr>
       <w:r>
-        <w:t>Graphene Effect Analysis — SSY Raman Spectroscopy</w:t>
+        <w:t>Graphene Effect Analysis - SSY Raman Spectroscopy</w:t>
       </w:r>
     </w:p>
     <w:p>
       <w:r>
-        <w:t>Copy all text below into a new PyCharm .py file and run.</w:t>
+        <w:t>Paste into a new PyCharm .py file and run.</w:t>
       </w:r>
     </w:p>
     <w:p>
       <w:r>
-        <w:t>Install first:  pip install pandas openpyxl scikit-learn scipy matplotlib</w:t>
+        <w:t>Install: pip install pandas openpyxl scikit-learn scipy matplotlib</w:t>
       </w:r>
     </w:p>
     <w:p/>
@@ -28,96 +28,59 @@
           <w:rFonts w:ascii="Courier New" w:hAnsi="Courier New"/>
           <w:sz w:val="16"/>
         </w:rPr>
-        <w:t>"""</w:t>
-        <w:br/>
-        <w:t>=============================================================================</w:t>
-        <w:br/>
-        <w:t>GRAPHENE EFFECT ANALYSIS  |  SSY Raman Spectroscopy</w:t>
-        <w:br/>
-        <w:t>Book2.xlsx  |  Sheet: "4 - Normalised"  |  100 spectra  |  450-1800 cm-1</w:t>
-        <w:br/>
-        <w:br/>
-        <w:t>SCIENTIFIC QUESTION</w:t>
-        <w:br/>
-        <w:t xml:space="preserve">  Does adding a graphene layer change the SSY Raman signal,</w:t>
-        <w:br/>
-        <w:t xml:space="preserve">  and is the effect consistent across both substrates (PDMS, SiO2/Si)?</w:t>
-        <w:br/>
-        <w:br/>
-        <w:t>PREPROCESSING (on top of the already-normalised data)</w:t>
-        <w:br/>
-        <w:t xml:space="preserve">  1. Savitzky-Golay smoothing      (window=7, poly=2)</w:t>
-        <w:br/>
-        <w:t xml:space="preserve">  2. ALS baseline correction       (removes substrate fluorescence background)</w:t>
-        <w:br/>
-        <w:t xml:space="preserve">  3. SNV normalisation             (removes intensity scale differences between sessions)</w:t>
-        <w:br/>
-        <w:br/>
-        <w:t>ANALYSES</w:t>
-        <w:br/>
-        <w:t xml:space="preserve">  A. Mean spectra + difference spectra  : mean(Gr-X) - mean(X) for X in {PDMS, SiO2/Si}</w:t>
-        <w:br/>
-        <w:t xml:space="preserve">  B. Graphene band intensities          : D-band (~1350) and G-band (~1580) box plots + stats</w:t>
-        <w:br/>
-        <w:t xml:space="preserve">  C. Binary PLS-DA : Gr (50) vs no-Gr (50)            - 3 LVs, 5-fold CV + LOO + perm (999)</w:t>
-        <w:br/>
-        <w:t xml:space="preserve">  D. PDMS-only binary  : Gr-PDMS (25) vs PDMS (25)    - 3 LVs, 5-fold CV + LOO + perm (999)</w:t>
-        <w:br/>
-        <w:t xml:space="preserve">  E. SiO2-only binary  : Gr-SiO2 (25) vs SiO2 (25)   - 3 LVs, 5-fold CV + LOO + perm (999)</w:t>
-        <w:br/>
-        <w:t xml:space="preserve">  F. VIP comparison    : all 3 binary models side by side</w:t>
-        <w:br/>
-        <w:t xml:space="preserve">  G. Accuracy summary  : all 3 models vs chance level (50%)</w:t>
-        <w:br/>
-        <w:br/>
-        <w:t>OUTPUTS -&gt; C:/Users/Hira Aman/Desktop/PROF_DOMENICO'S/GrapheneEffect_Analysis/</w:t>
-        <w:br/>
-        <w:t xml:space="preserve">  01_Mean_Spectra.png</w:t>
-        <w:br/>
-        <w:t xml:space="preserve">  02_Difference_Spectra.png</w:t>
-        <w:br/>
-        <w:t xml:space="preserve">  03_Graphene_Band_Boxplots.png</w:t>
-        <w:br/>
-        <w:t xml:space="preserve">  04_DG_Ratio.png</w:t>
-        <w:br/>
-        <w:t xml:space="preserve">  05_Binary_GrNoGr_Scores.png</w:t>
-        <w:br/>
-        <w:t xml:space="preserve">  06_Binary_GrNoGr_VIP.png</w:t>
-        <w:br/>
-        <w:t xml:space="preserve">  07_Binary_GrNoGr_Confusion.png</w:t>
-        <w:br/>
-        <w:t xml:space="preserve">  08_Binary_GrNoGr_Permutation.png</w:t>
-        <w:br/>
-        <w:t xml:space="preserve">  09_PDMS_Binary_Scores.png</w:t>
-        <w:br/>
-        <w:t xml:space="preserve">  10_PDMS_Binary_VIP.png</w:t>
-        <w:br/>
-        <w:t xml:space="preserve">  11_PDMS_Binary_Confusion.png</w:t>
-        <w:br/>
-        <w:t xml:space="preserve">  12_PDMS_Binary_Permutation.png</w:t>
-        <w:br/>
-        <w:t xml:space="preserve">  13_SiO2_Binary_Scores.png</w:t>
-        <w:br/>
-        <w:t xml:space="preserve">  14_SiO2_Binary_VIP.png</w:t>
-        <w:br/>
-        <w:t xml:space="preserve">  15_SiO2_Binary_Confusion.png</w:t>
-        <w:br/>
-        <w:t xml:space="preserve">  16_SiO2_Binary_Permutation.png</w:t>
-        <w:br/>
-        <w:t xml:space="preserve">  17_VIP_Comparison.png</w:t>
-        <w:br/>
-        <w:t xml:space="preserve">  18_Accuracy_Summary.png</w:t>
-        <w:br/>
-        <w:t xml:space="preserve">  GrapheneEffect_Results.xlsx</w:t>
-        <w:br/>
-        <w:br/>
-        <w:t>HOW TO RUN (PyCharm Terminal):</w:t>
-        <w:br/>
-        <w:t xml:space="preserve">  pip install pandas openpyxl scikit-learn scipy matplotlib</w:t>
-        <w:br/>
-        <w:t>=============================================================================</w:t>
-        <w:br/>
-        <w:t>"""</w:t>
+        <w:t># =============================================================================</w:t>
+        <w:br/>
+        <w:t># GRAPHENE EFFECT ANALYSIS  |  SSY Raman Spectroscopy</w:t>
+        <w:br/>
+        <w:t># Book2.xlsx  |  Sheet: 4 - Normalised  |  100 spectra  |  450-1800 cm-1</w:t>
+        <w:br/>
+        <w:t>#</w:t>
+        <w:br/>
+        <w:t># SCIENTIFIC QUESTION</w:t>
+        <w:br/>
+        <w:t>#   Does adding a graphene layer change the SSY Raman signal,</w:t>
+        <w:br/>
+        <w:t>#   and is the effect consistent across both substrates (PDMS, SiO2/Si)?</w:t>
+        <w:br/>
+        <w:t>#</w:t>
+        <w:br/>
+        <w:t># PREPROCESSING (on top of the already-normalised data)</w:t>
+        <w:br/>
+        <w:t>#   1. Savitzky-Golay smoothing      (window=7, poly=2)</w:t>
+        <w:br/>
+        <w:t>#   2. ALS baseline correction       (removes substrate fluorescence background)</w:t>
+        <w:br/>
+        <w:t>#   3. SNV normalisation             (removes intensity scale differences between sessions)</w:t>
+        <w:br/>
+        <w:t>#</w:t>
+        <w:br/>
+        <w:t># ANALYSES</w:t>
+        <w:br/>
+        <w:t>#   A. Mean spectra + difference spectra  : mean(Gr-X) - mean(X) per substrate</w:t>
+        <w:br/>
+        <w:t>#   B. Graphene band intensities          : D-band (~1350) and G-band (~1580) box plots + stats</w:t>
+        <w:br/>
+        <w:t>#   C. Binary PLS-DA : Gr (50) vs no-Gr (50)   - 3 LVs, 5-fold CV + LOO + perm (999)</w:t>
+        <w:br/>
+        <w:t>#   D. PDMS-only     : Gr-PDMS (25) vs PDMS (25)</w:t>
+        <w:br/>
+        <w:t>#   E. SiO2-only     : Gr-SiO2 (25) vs SiO2 (25)</w:t>
+        <w:br/>
+        <w:t>#   F. VIP comparison: all 3 binary models side by side</w:t>
+        <w:br/>
+        <w:t>#   G. Accuracy summary</w:t>
+        <w:br/>
+        <w:t>#</w:t>
+        <w:br/>
+        <w:t># OUTPUTS -&gt; GrapheneEffect_Analysis folder (see OUTPUT_DIR below)</w:t>
+        <w:br/>
+        <w:t>#</w:t>
+        <w:br/>
+        <w:t># HOW TO RUN (PyCharm Terminal):</w:t>
+        <w:br/>
+        <w:t>#   pip install pandas openpyxl scikit-learn scipy matplotlib</w:t>
+        <w:br/>
+        <w:t># =============================================================================</w:t>
         <w:br/>
         <w:br/>
         <w:t>import os</w:t>

</xml_diff>